<commit_message>
docs: align the project brief with the retained stack
The brief still listed the initial forecast (Scikit-learn only, Power BI
/ Metabase). It now lists the retained stack: Python and Poetry, Pandas,
PostgreSQL in Bronze / Silver / Gold layers, dbt, Apache Airflow,
Scikit-learn and XGBoost with MLflow, FastAPI, Streamlit, Docker and
GitHub Actions. MongoDB is deliberately left out: the project does not
need a document store.

Co-Authored-By: Claude Opus 5.5 <noreply@anthropic.com>
</commit_message>
<xml_diff>
--- a/Churn Data Platform.docx
+++ b/Churn Data Platform.docx
@@ -698,7 +698,7 @@
         <w:rPr>
           <w:rtl w:val="0"/>
         </w:rPr>
-        <w:t xml:space="preserve"> : Python</w:t>
+        <w:t xml:space="preserve"> : Python (dépendances gérées avec Poetry)</w:t>
       </w:r>
     </w:p>
     <w:p>
@@ -746,7 +746,7 @@
         <w:rPr>
           <w:rtl w:val="0"/>
         </w:rPr>
-        <w:t xml:space="preserve"> : PostgreSQL</w:t>
+        <w:t xml:space="preserve"> : PostgreSQL, organisée en couches Bronze / Silver / Gold (pattern Medallion)</w:t>
       </w:r>
     </w:p>
     <w:p>
@@ -764,6 +764,30 @@
           <w:bCs w:val="1"/>
           <w:rtl w:val="0"/>
         </w:rPr>
+        <w:t xml:space="preserve">Transformation</w:t>
+      </w:r>
+      <w:r>
+        <w:rPr>
+          <w:rtl w:val="0"/>
+        </w:rPr>
+        <w:t xml:space="preserve"> : dbt</w:t>
+      </w:r>
+    </w:p>
+    <w:p>
+      <w:pPr>
+        <w:numPr>
+          <w:ilvl w:val="0"/>
+          <w:numId w:val="13"/>
+        </w:numPr>
+        <w:spacing w:after="0" w:afterAutospacing="0" w:before="0" w:beforeAutospacing="0" w:lineRule="auto"/>
+        <w:ind w:left="720" w:hanging="360"/>
+      </w:pPr>
+      <w:r>
+        <w:rPr>
+          <w:b w:val="1"/>
+          <w:bCs w:val="1"/>
+          <w:rtl w:val="0"/>
+        </w:rPr>
         <w:t xml:space="preserve">Orchestration</w:t>
       </w:r>
       <w:r>
@@ -794,7 +818,7 @@
         <w:rPr>
           <w:rtl w:val="0"/>
         </w:rPr>
-        <w:t xml:space="preserve"> : Scikit-learn</w:t>
+        <w:t xml:space="preserve"> : Scikit-learn et XGBoost, suivi des expériences avec MLflow</w:t>
       </w:r>
     </w:p>
     <w:p>
@@ -827,6 +851,54 @@
           <w:ilvl w:val="0"/>
           <w:numId w:val="13"/>
         </w:numPr>
+        <w:spacing w:after="0" w:afterAutospacing="0" w:before="0" w:beforeAutospacing="0" w:lineRule="auto"/>
+        <w:ind w:left="720" w:hanging="360"/>
+      </w:pPr>
+      <w:r>
+        <w:rPr>
+          <w:b w:val="1"/>
+          <w:bCs w:val="1"/>
+          <w:rtl w:val="0"/>
+        </w:rPr>
+        <w:t xml:space="preserve">Visualisation</w:t>
+      </w:r>
+      <w:r>
+        <w:rPr>
+          <w:rtl w:val="0"/>
+        </w:rPr>
+        <w:t xml:space="preserve"> : Streamlit</w:t>
+      </w:r>
+    </w:p>
+    <w:p>
+      <w:pPr>
+        <w:numPr>
+          <w:ilvl w:val="0"/>
+          <w:numId w:val="13"/>
+        </w:numPr>
+        <w:spacing w:after="0" w:afterAutospacing="0" w:before="0" w:beforeAutospacing="0" w:lineRule="auto"/>
+        <w:ind w:left="720" w:hanging="360"/>
+      </w:pPr>
+      <w:r>
+        <w:rPr>
+          <w:b w:val="1"/>
+          <w:bCs w:val="1"/>
+          <w:rtl w:val="0"/>
+        </w:rPr>
+        <w:t xml:space="preserve">Conteneurisation</w:t>
+      </w:r>
+      <w:r>
+        <w:rPr>
+          <w:rtl w:val="0"/>
+        </w:rPr>
+        <w:t xml:space="preserve"> : Docker (docker-compose)</w:t>
+      </w:r>
+    </w:p>
+    <w:p>
+      <w:pPr>
+        <w:numPr>
+          <w:ilvl w:val="0"/>
+          <w:numId w:val="13"/>
+        </w:numPr>
         <w:spacing w:after="240" w:before="0" w:beforeAutospacing="0" w:lineRule="auto"/>
         <w:ind w:left="720" w:hanging="360"/>
       </w:pPr>
@@ -836,13 +908,13 @@
           <w:bCs w:val="1"/>
           <w:rtl w:val="0"/>
         </w:rPr>
-        <w:t xml:space="preserve">Visualisation</w:t>
-      </w:r>
-      <w:r>
-        <w:rPr>
-          <w:rtl w:val="0"/>
-        </w:rPr>
-        <w:t xml:space="preserve"> : Power BI / Metabase</w:t>
+        <w:t xml:space="preserve">CI/CD</w:t>
+      </w:r>
+      <w:r>
+        <w:rPr>
+          <w:rtl w:val="0"/>
+        </w:rPr>
+        <w:t xml:space="preserve"> : GitHub Actions</w:t>
       </w:r>
     </w:p>
     <w:p>

</xml_diff>